<commit_message>
Add Q9 presentation slide deck to dashboard and docx
Co-Authored-By: Claude Sonnet 4.6 <noreply@anthropic.com>
</commit_message>
<xml_diff>
--- a/HAAT_DA_Solution.docx
+++ b/HAAT_DA_Solution.docx
@@ -13501,20 +13501,974 @@
     <w:p>
       <w:pPr>
         <w:bidi w:val="1"/>
-        <w:spacing w:before="160" w:after="80"/>
-        <w:jc w:val="right"/>
-        <w:shd w:val="clear" w:color="auto" w:fill="F5F5F5"/>
-      </w:pPr>
-      <w:r>
-        <w:rPr>
-          <w:rFonts w:ascii="Arial" w:hAnsi="Arial"/>
-          <w:b w:val="0"/>
-          <w:i/>
-          <w:color w:val="AAAAAA"/>
+        <w:spacing w:before="200" w:after="20"/>
+        <w:jc w:val="right"/>
+      </w:pPr>
+      <w:r>
+        <w:rPr>
+          <w:rFonts w:ascii="Arial" w:hAnsi="Arial"/>
+          <w:b/>
+          <w:i w:val="0"/>
+          <w:color w:val="1A376C"/>
+          <w:sz w:val="22"/>
+          <w:lang w:bidi="he-IL"/>
+        </w:rPr>
+        <w:t>שקופית 1 — הממצא החשוב ביותר</w:t>
+      </w:r>
+    </w:p>
+    <w:p>
+      <w:pPr>
+        <w:bidi w:val="1"/>
+        <w:spacing w:before="0" w:after="0"/>
+        <w:jc w:val="right"/>
+        <w:pBdr>
+          <w:bottom w:val="single" w:sz="6" w:space="1" w:color="CCCCCC"/>
+        </w:pBdr>
+      </w:pPr>
+    </w:p>
+    <w:p>
+      <w:pPr>
+        <w:bidi w:val="1"/>
+        <w:spacing w:before="80" w:after="160"/>
+        <w:jc w:val="right"/>
+      </w:pPr>
+      <w:r>
+        <w:rPr>
+          <w:rFonts w:ascii="Arial" w:hAnsi="Arial"/>
+          <w:b/>
+          <w:i w:val="0"/>
+          <w:color w:val="1A376C"/>
+          <w:sz w:val="26"/>
+          <w:lang w:bidi="he-IL"/>
+        </w:rPr>
+        <w:t>❝ 1 מתוך 3 הזמנות לא מגיעה ללקוח — וזה לא בעיה של ביקוש, זו בעיה של היצע שליחים ❞</w:t>
+      </w:r>
+    </w:p>
+    <w:p>
+      <w:pPr>
+        <w:bidi w:val="1"/>
+        <w:spacing w:before="60" w:after="60"/>
+        <w:jc w:val="right"/>
+      </w:pPr>
+      <w:r>
+        <w:rPr>
+          <w:rFonts w:ascii="Arial" w:hAnsi="Arial"/>
+          <w:b w:val="0"/>
+          <w:i w:val="0"/>
+          <w:color w:val="595959"/>
+          <w:sz w:val="22"/>
+          <w:lang w:bidi="he-IL"/>
+        </w:rPr>
+        <w:t>שיעור המסירה הכולל עומד על 66.1% — כלומר 33.9% מההזמנות (9,716 הזמנות) לא הגיעו ללקוח. בממוצע ערך הזמנה של ₪119.44, מדובר על פוטנציאל הכנסה של כ-₪1.16M שלא מומש ב-18 שבועות בלבד.</w:t>
+      </w:r>
+    </w:p>
+    <w:p>
+      <w:pPr>
+        <w:bidi w:val="1"/>
+        <w:spacing w:before="60" w:after="120"/>
+        <w:ind w:left="283"/>
+        <w:jc w:val="right"/>
+      </w:pPr>
+      <w:r>
+        <w:rPr>
+          <w:rFonts w:ascii="Arial" w:hAnsi="Arial"/>
+          <w:b/>
+          <w:i w:val="0"/>
+          <w:color w:val="2674C1"/>
+          <w:sz w:val="22"/>
+          <w:lang w:bidi="he-IL"/>
+        </w:rPr>
+        <w:t xml:space="preserve">• </w:t>
+      </w:r>
+      <w:r>
+        <w:rPr>
+          <w:rFonts w:ascii="Arial" w:hAnsi="Arial"/>
+          <w:b w:val="0"/>
+          <w:i w:val="0"/>
+          <w:color w:val="595959"/>
+          <w:sz w:val="22"/>
+          <w:lang w:bidi="he-IL"/>
+        </w:rPr>
+        <w:t>הנתון הקריטי: בשבת — יום השיא בביקוש — שיעור המסירה הוא 63.1% בלבד (הגרוע ביותר). בימי ראשון, כשהביקוש נמוך ב-19%, שיעור המסירה עולה ל-67.5%. זה מוכיח שהבעיה היא לא איכות הלקוחות או המוצר — אלא מחסור בשליחים בשעות השיא.</w:t>
+      </w:r>
+    </w:p>
+    <w:p>
+      <w:pPr>
+        <w:spacing w:after="120"/>
+      </w:pPr>
+    </w:p>
+    <w:p>
+      <w:pPr>
+        <w:bidi w:val="1"/>
+        <w:spacing w:before="200" w:after="20"/>
+        <w:jc w:val="right"/>
+      </w:pPr>
+      <w:r>
+        <w:rPr>
+          <w:rFonts w:ascii="Arial" w:hAnsi="Arial"/>
+          <w:b/>
+          <w:i w:val="0"/>
+          <w:color w:val="1A376C"/>
+          <w:sz w:val="22"/>
+          <w:lang w:bidi="he-IL"/>
+        </w:rPr>
+        <w:t>שקופית 2 — שלושה מספרים שמספרים את הסיפור</w:t>
+      </w:r>
+    </w:p>
+    <w:p>
+      <w:pPr>
+        <w:bidi w:val="1"/>
+        <w:spacing w:before="0" w:after="0"/>
+        <w:jc w:val="right"/>
+        <w:pBdr>
+          <w:bottom w:val="single" w:sz="6" w:space="1" w:color="CCCCCC"/>
+        </w:pBdr>
+      </w:pPr>
+    </w:p>
+    <w:p>
+      <w:pPr>
+        <w:bidi w:val="1"/>
+        <w:spacing w:before="120" w:after="0"/>
+        <w:jc w:val="right"/>
+        <w:shd w:val="clear" w:color="auto" w:fill="FFF8E1"/>
+      </w:pPr>
+      <w:r>
+        <w:rPr>
+          <w:rFonts w:ascii="Arial" w:hAnsi="Arial"/>
+          <w:b/>
+          <w:i w:val="0"/>
+          <w:color w:val="8B6000"/>
           <w:sz w:val="20"/>
           <w:lang w:bidi="he-IL"/>
         </w:rPr>
-        <w:t>[ הערות נוספות לפרזנטציה ישלימו כאן ]</w:t>
+        <w:t xml:space="preserve">  ממצאים מהנתונים:</w:t>
+      </w:r>
+    </w:p>
+    <w:p>
+      <w:pPr>
+        <w:bidi w:val="1"/>
+        <w:spacing w:before="40" w:after="60"/>
+        <w:ind w:left="227"/>
+        <w:jc w:val="right"/>
+        <w:shd w:val="clear" w:color="auto" w:fill="FFFDE7"/>
+      </w:pPr>
+      <w:r>
+        <w:rPr>
+          <w:rFonts w:ascii="Arial" w:hAnsi="Arial"/>
+          <w:b w:val="0"/>
+          <w:i w:val="0"/>
+          <w:color w:val="5D4000"/>
+          <w:sz w:val="20"/>
+          <w:lang w:bidi="he-IL"/>
+        </w:rPr>
+        <w:t>66.1%  — שיעור מסירה כולל | כלומר 9,716 הזמנות שלא הגיעו ללקוח</w:t>
+      </w:r>
+    </w:p>
+    <w:p>
+      <w:pPr>
+        <w:bidi w:val="1"/>
+        <w:spacing w:before="40" w:after="60"/>
+        <w:ind w:left="227"/>
+        <w:jc w:val="right"/>
+        <w:shd w:val="clear" w:color="auto" w:fill="FFFDE7"/>
+      </w:pPr>
+      <w:r>
+        <w:rPr>
+          <w:rFonts w:ascii="Arial" w:hAnsi="Arial"/>
+          <w:b w:val="0"/>
+          <w:i w:val="0"/>
+          <w:color w:val="5D4000"/>
+          <w:sz w:val="20"/>
+          <w:lang w:bidi="he-IL"/>
+        </w:rPr>
+      </w:r>
+    </w:p>
+    <w:p>
+      <w:pPr>
+        <w:bidi w:val="1"/>
+        <w:spacing w:before="40" w:after="60"/>
+        <w:ind w:left="227"/>
+        <w:jc w:val="right"/>
+        <w:shd w:val="clear" w:color="auto" w:fill="FFFDE7"/>
+      </w:pPr>
+      <w:r>
+        <w:rPr>
+          <w:rFonts w:ascii="Arial" w:hAnsi="Arial"/>
+          <w:b w:val="0"/>
+          <w:i w:val="0"/>
+          <w:color w:val="5D4000"/>
+          <w:sz w:val="20"/>
+          <w:lang w:bidi="he-IL"/>
+        </w:rPr>
+        <w:t>63.1%  — שיעור מסירה בשבת (יום השיא בנפח, 271 הזמנות/יום)</w:t>
+      </w:r>
+    </w:p>
+    <w:p>
+      <w:pPr>
+        <w:bidi w:val="1"/>
+        <w:spacing w:before="40" w:after="60"/>
+        <w:ind w:left="227"/>
+        <w:jc w:val="right"/>
+        <w:shd w:val="clear" w:color="auto" w:fill="FFFDE7"/>
+      </w:pPr>
+      <w:r>
+        <w:rPr>
+          <w:rFonts w:ascii="Arial" w:hAnsi="Arial"/>
+          <w:b w:val="0"/>
+          <w:i w:val="0"/>
+          <w:color w:val="5D4000"/>
+          <w:sz w:val="20"/>
+          <w:lang w:bidi="he-IL"/>
+        </w:rPr>
+        <w:t xml:space="preserve">          vs 67.5% בראשון (יום שקט יותר, 227 הזמנות/יום)</w:t>
+      </w:r>
+    </w:p>
+    <w:p>
+      <w:pPr>
+        <w:bidi w:val="1"/>
+        <w:spacing w:before="40" w:after="60"/>
+        <w:ind w:left="227"/>
+        <w:jc w:val="right"/>
+        <w:shd w:val="clear" w:color="auto" w:fill="FFFDE7"/>
+      </w:pPr>
+      <w:r>
+        <w:rPr>
+          <w:rFonts w:ascii="Arial" w:hAnsi="Arial"/>
+          <w:b w:val="0"/>
+          <w:i w:val="0"/>
+          <w:color w:val="5D4000"/>
+          <w:sz w:val="20"/>
+          <w:lang w:bidi="he-IL"/>
+        </w:rPr>
+        <w:t xml:space="preserve">          — שלפי כך, כל 100 הזמנות נוספות = 4.4 מסירות שנאבדות</w:t>
+      </w:r>
+    </w:p>
+    <w:p>
+      <w:pPr>
+        <w:bidi w:val="1"/>
+        <w:spacing w:before="40" w:after="60"/>
+        <w:ind w:left="227"/>
+        <w:jc w:val="right"/>
+        <w:shd w:val="clear" w:color="auto" w:fill="FFFDE7"/>
+      </w:pPr>
+      <w:r>
+        <w:rPr>
+          <w:rFonts w:ascii="Arial" w:hAnsi="Arial"/>
+          <w:b w:val="0"/>
+          <w:i w:val="0"/>
+          <w:color w:val="5D4000"/>
+          <w:sz w:val="20"/>
+          <w:lang w:bidi="he-IL"/>
+        </w:rPr>
+      </w:r>
+    </w:p>
+    <w:p>
+      <w:pPr>
+        <w:bidi w:val="1"/>
+        <w:spacing w:before="40" w:after="60"/>
+        <w:ind w:left="227"/>
+        <w:jc w:val="right"/>
+        <w:shd w:val="clear" w:color="auto" w:fill="FFFDE7"/>
+      </w:pPr>
+      <w:r>
+        <w:rPr>
+          <w:rFonts w:ascii="Arial" w:hAnsi="Arial"/>
+          <w:b w:val="0"/>
+          <w:i w:val="0"/>
+          <w:color w:val="5D4000"/>
+          <w:sz w:val="20"/>
+          <w:lang w:bidi="he-IL"/>
+        </w:rPr>
+        <w:t>48.4%  — שיעור מסירה בשבוע 8–14 אפריל (שפל כלל-תקופה)</w:t>
+      </w:r>
+    </w:p>
+    <w:p>
+      <w:pPr>
+        <w:bidi w:val="1"/>
+        <w:spacing w:before="40" w:after="60"/>
+        <w:ind w:left="227"/>
+        <w:jc w:val="right"/>
+        <w:shd w:val="clear" w:color="auto" w:fill="FFFDE7"/>
+      </w:pPr>
+      <w:r>
+        <w:rPr>
+          <w:rFonts w:ascii="Arial" w:hAnsi="Arial"/>
+          <w:b w:val="0"/>
+          <w:i w:val="0"/>
+          <w:color w:val="5D4000"/>
+          <w:sz w:val="20"/>
+          <w:lang w:bidi="he-IL"/>
+        </w:rPr>
+        <w:t xml:space="preserve">          כשמשהו הפריע להיצע השליחים, כמעט מחצית מההזמנות נפלו</w:t>
+      </w:r>
+    </w:p>
+    <w:p>
+      <w:pPr>
+        <w:spacing w:after="80"/>
+      </w:pPr>
+    </w:p>
+    <w:p>
+      <w:pPr>
+        <w:spacing w:after="120"/>
+      </w:pPr>
+    </w:p>
+    <w:p>
+      <w:pPr>
+        <w:bidi w:val="1"/>
+        <w:spacing w:before="200" w:after="20"/>
+        <w:jc w:val="right"/>
+      </w:pPr>
+      <w:r>
+        <w:rPr>
+          <w:rFonts w:ascii="Arial" w:hAnsi="Arial"/>
+          <w:b/>
+          <w:i w:val="0"/>
+          <w:color w:val="1A376C"/>
+          <w:sz w:val="22"/>
+          <w:lang w:bidi="he-IL"/>
+        </w:rPr>
+        <w:t>שקופית 3 — ממצא שהפתיע אותי</w:t>
+      </w:r>
+    </w:p>
+    <w:p>
+      <w:pPr>
+        <w:bidi w:val="1"/>
+        <w:spacing w:before="0" w:after="0"/>
+        <w:jc w:val="right"/>
+        <w:pBdr>
+          <w:bottom w:val="single" w:sz="6" w:space="1" w:color="CCCCCC"/>
+        </w:pBdr>
+      </w:pPr>
+    </w:p>
+    <w:p>
+      <w:pPr>
+        <w:bidi w:val="1"/>
+        <w:spacing w:before="60" w:after="60"/>
+        <w:jc w:val="right"/>
+      </w:pPr>
+      <w:r>
+        <w:rPr>
+          <w:rFonts w:ascii="Arial" w:hAnsi="Arial"/>
+          <w:b w:val="0"/>
+          <w:i w:val="0"/>
+          <w:color w:val="595959"/>
+          <w:sz w:val="22"/>
+          <w:lang w:bidi="he-IL"/>
+        </w:rPr>
+        <w:t>57.6% מלקוחות המזומן רשמו כרטיס אשראי במערכת — ובחרו לשלם מזומן בכל זאת.</w:t>
+      </w:r>
+    </w:p>
+    <w:p>
+      <w:pPr>
+        <w:bidi w:val="1"/>
+        <w:spacing w:before="60" w:after="120"/>
+        <w:ind w:left="283"/>
+        <w:jc w:val="right"/>
+      </w:pPr>
+      <w:r>
+        <w:rPr>
+          <w:rFonts w:ascii="Arial" w:hAnsi="Arial"/>
+          <w:b/>
+          <w:i w:val="0"/>
+          <w:color w:val="2674C1"/>
+          <w:sz w:val="22"/>
+          <w:lang w:bidi="he-IL"/>
+        </w:rPr>
+        <w:t xml:space="preserve">• </w:t>
+      </w:r>
+      <w:r>
+        <w:rPr>
+          <w:rFonts w:ascii="Arial" w:hAnsi="Arial"/>
+          <w:b w:val="0"/>
+          <w:i w:val="0"/>
+          <w:color w:val="595959"/>
+          <w:sz w:val="22"/>
+          <w:lang w:bidi="he-IL"/>
+        </w:rPr>
+        <w:t>זה אומר שיש 9,190 לקוחות שסומכים על HAAT מספיק כדי לשמור כרטיס, אבל מעדיפים מזומן מסיבה כלשהי (פרטיות? הרגל? חשש מחיוב?).</w:t>
+      </w:r>
+    </w:p>
+    <w:p>
+      <w:pPr>
+        <w:bidi w:val="1"/>
+        <w:spacing w:before="60" w:after="120"/>
+        <w:ind w:left="283"/>
+        <w:jc w:val="right"/>
+      </w:pPr>
+      <w:r>
+        <w:rPr>
+          <w:rFonts w:ascii="Arial" w:hAnsi="Arial"/>
+          <w:b/>
+          <w:i w:val="0"/>
+          <w:color w:val="2674C1"/>
+          <w:sz w:val="22"/>
+          <w:lang w:bidi="he-IL"/>
+        </w:rPr>
+        <w:t xml:space="preserve">• </w:t>
+      </w:r>
+      <w:r>
+        <w:rPr>
+          <w:rFonts w:ascii="Arial" w:hAnsi="Arial"/>
+          <w:b w:val="0"/>
+          <w:i w:val="0"/>
+          <w:color w:val="595959"/>
+          <w:sz w:val="22"/>
+          <w:lang w:bidi="he-IL"/>
+        </w:rPr>
+        <w:t>אלה לא לקוחות שחוששים מהאפליקציה — הם כבר רשומים. עם קמפיין ממוקד קטן (קאשבק, הנחה בתשלום אשראי ראשון) ניתן לגרום לחלק גדול מהם לעבור — מה שמשפר מעקב, מדידה ואפשרות לתכנית נאמנות.</w:t>
+      </w:r>
+    </w:p>
+    <w:p>
+      <w:pPr>
+        <w:spacing w:after="120"/>
+      </w:pPr>
+    </w:p>
+    <w:p>
+      <w:pPr>
+        <w:bidi w:val="1"/>
+        <w:spacing w:before="200" w:after="20"/>
+        <w:jc w:val="right"/>
+      </w:pPr>
+      <w:r>
+        <w:rPr>
+          <w:rFonts w:ascii="Arial" w:hAnsi="Arial"/>
+          <w:b/>
+          <w:i w:val="0"/>
+          <w:color w:val="1A376C"/>
+          <w:sz w:val="22"/>
+          <w:lang w:bidi="he-IL"/>
+        </w:rPr>
+        <w:t>שקופית 4 — מה שלא הצלחתי להסביר לחלוטין</w:t>
+      </w:r>
+    </w:p>
+    <w:p>
+      <w:pPr>
+        <w:bidi w:val="1"/>
+        <w:spacing w:before="0" w:after="0"/>
+        <w:jc w:val="right"/>
+        <w:pBdr>
+          <w:bottom w:val="single" w:sz="6" w:space="1" w:color="CCCCCC"/>
+        </w:pBdr>
+      </w:pPr>
+    </w:p>
+    <w:p>
+      <w:pPr>
+        <w:bidi w:val="1"/>
+        <w:spacing w:before="60" w:after="60"/>
+        <w:jc w:val="right"/>
+      </w:pPr>
+      <w:r>
+        <w:rPr>
+          <w:rFonts w:ascii="Arial" w:hAnsi="Arial"/>
+          <w:b w:val="0"/>
+          <w:i w:val="0"/>
+          <w:color w:val="595959"/>
+          <w:sz w:val="22"/>
+          <w:lang w:bidi="he-IL"/>
+        </w:rPr>
+        <w:t>שבוע 8–14 אפריל: שיעור המסירה קרס ל-48.4% — אבל נפח ההזמנות דווקא עלה ב-15.4%.</w:t>
+      </w:r>
+    </w:p>
+    <w:p>
+      <w:pPr>
+        <w:bidi w:val="1"/>
+        <w:spacing w:before="60" w:after="120"/>
+        <w:ind w:left="283"/>
+        <w:jc w:val="right"/>
+      </w:pPr>
+      <w:r>
+        <w:rPr>
+          <w:rFonts w:ascii="Arial" w:hAnsi="Arial"/>
+          <w:b/>
+          <w:i w:val="0"/>
+          <w:color w:val="2674C1"/>
+          <w:sz w:val="22"/>
+          <w:lang w:bidi="he-IL"/>
+        </w:rPr>
+        <w:t xml:space="preserve">• </w:t>
+      </w:r>
+      <w:r>
+        <w:rPr>
+          <w:rFonts w:ascii="Arial" w:hAnsi="Arial"/>
+          <w:b w:val="0"/>
+          <w:i w:val="0"/>
+          <w:color w:val="595959"/>
+          <w:sz w:val="22"/>
+          <w:lang w:bidi="he-IL"/>
+        </w:rPr>
+        <w:t>הסבר אפשרי: ב-13 אפריל 2024 ישראל חוותה תקיפת טילים ומל"טים מאיראן. אם נהגים בחרו לא לצאת בסוף השבוע הזה — זה מסביר את הקריסה.</w:t>
+      </w:r>
+    </w:p>
+    <w:p>
+      <w:pPr>
+        <w:bidi w:val="1"/>
+        <w:spacing w:before="60" w:after="120"/>
+        <w:ind w:left="283"/>
+        <w:jc w:val="right"/>
+      </w:pPr>
+      <w:r>
+        <w:rPr>
+          <w:rFonts w:ascii="Arial" w:hAnsi="Arial"/>
+          <w:b/>
+          <w:i w:val="0"/>
+          <w:color w:val="2674C1"/>
+          <w:sz w:val="22"/>
+          <w:lang w:bidi="he-IL"/>
+        </w:rPr>
+        <w:t xml:space="preserve">• </w:t>
+      </w:r>
+      <w:r>
+        <w:rPr>
+          <w:rFonts w:ascii="Arial" w:hAnsi="Arial"/>
+          <w:b w:val="0"/>
+          <w:i w:val="0"/>
+          <w:color w:val="595959"/>
+          <w:sz w:val="22"/>
+          <w:lang w:bidi="he-IL"/>
+        </w:rPr>
+        <w:t>אך ללא נתוני פעילות שליחים (כמה שליחים היו online, מאיפה, באיזו שעה) לא ניתן לאשר זאת. יתכן גם כשל טכני, אירוע תפעולי מקומי, או שילוב שניהם. הנתון מחייב חקירה נוספת.</w:t>
+      </w:r>
+    </w:p>
+    <w:p>
+      <w:pPr>
+        <w:spacing w:after="120"/>
+      </w:pPr>
+    </w:p>
+    <w:p>
+      <w:pPr>
+        <w:bidi w:val="1"/>
+        <w:spacing w:before="200" w:after="20"/>
+        <w:jc w:val="right"/>
+      </w:pPr>
+      <w:r>
+        <w:rPr>
+          <w:rFonts w:ascii="Arial" w:hAnsi="Arial"/>
+          <w:b/>
+          <w:i w:val="0"/>
+          <w:color w:val="1A376C"/>
+          <w:sz w:val="22"/>
+          <w:lang w:bidi="he-IL"/>
+        </w:rPr>
+        <w:t>שקופית 5 — המלצה אחת שניתן ליישם השבוע הבא</w:t>
+      </w:r>
+    </w:p>
+    <w:p>
+      <w:pPr>
+        <w:bidi w:val="1"/>
+        <w:spacing w:before="0" w:after="0"/>
+        <w:jc w:val="right"/>
+        <w:pBdr>
+          <w:bottom w:val="single" w:sz="6" w:space="1" w:color="CCCCCC"/>
+        </w:pBdr>
+      </w:pPr>
+    </w:p>
+    <w:p>
+      <w:pPr>
+        <w:bidi w:val="1"/>
+        <w:spacing w:before="80" w:after="120"/>
+        <w:jc w:val="right"/>
+      </w:pPr>
+      <w:r>
+        <w:rPr>
+          <w:rFonts w:ascii="Arial" w:hAnsi="Arial"/>
+          <w:b/>
+          <w:i w:val="0"/>
+          <w:color w:val="1B5E20"/>
+          <w:sz w:val="24"/>
+          <w:lang w:bidi="he-IL"/>
+        </w:rPr>
+        <w:t>השקיעו בגיוס שליחים ייעודיים לסוף שבוע באזורי ה-TOP.</w:t>
+      </w:r>
+    </w:p>
+    <w:p>
+      <w:pPr>
+        <w:bidi w:val="1"/>
+        <w:spacing w:before="120" w:after="0"/>
+        <w:jc w:val="right"/>
+        <w:shd w:val="clear" w:color="auto" w:fill="FFF8E1"/>
+      </w:pPr>
+      <w:r>
+        <w:rPr>
+          <w:rFonts w:ascii="Arial" w:hAnsi="Arial"/>
+          <w:b/>
+          <w:i w:val="0"/>
+          <w:color w:val="8B6000"/>
+          <w:sz w:val="20"/>
+          <w:lang w:bidi="he-IL"/>
+        </w:rPr>
+        <w:t xml:space="preserve">  ממצאים מהנתונים:</w:t>
+      </w:r>
+    </w:p>
+    <w:p>
+      <w:pPr>
+        <w:bidi w:val="1"/>
+        <w:spacing w:before="40" w:after="60"/>
+        <w:ind w:left="227"/>
+        <w:jc w:val="right"/>
+        <w:shd w:val="clear" w:color="auto" w:fill="FFFDE7"/>
+      </w:pPr>
+      <w:r>
+        <w:rPr>
+          <w:rFonts w:ascii="Arial" w:hAnsi="Arial"/>
+          <w:b w:val="0"/>
+          <w:i w:val="0"/>
+          <w:color w:val="5D4000"/>
+          <w:sz w:val="20"/>
+          <w:lang w:bidi="he-IL"/>
+        </w:rPr>
+        <w:t>מה לעשות:</w:t>
+      </w:r>
+    </w:p>
+    <w:p>
+      <w:pPr>
+        <w:bidi w:val="1"/>
+        <w:spacing w:before="40" w:after="60"/>
+        <w:ind w:left="227"/>
+        <w:jc w:val="right"/>
+        <w:shd w:val="clear" w:color="auto" w:fill="FFFDE7"/>
+      </w:pPr>
+      <w:r>
+        <w:rPr>
+          <w:rFonts w:ascii="Arial" w:hAnsi="Arial"/>
+          <w:b w:val="0"/>
+          <w:i w:val="0"/>
+          <w:color w:val="5D4000"/>
+          <w:sz w:val="20"/>
+          <w:lang w:bidi="he-IL"/>
+        </w:rPr>
+        <w:t xml:space="preserve">  1. גייסו 20–30 שליחים נוספים ספציפית לשישי-שבת באזורים 1, 4, 10</w:t>
+      </w:r>
+    </w:p>
+    <w:p>
+      <w:pPr>
+        <w:bidi w:val="1"/>
+        <w:spacing w:before="40" w:after="60"/>
+        <w:ind w:left="227"/>
+        <w:jc w:val="right"/>
+        <w:shd w:val="clear" w:color="auto" w:fill="FFFDE7"/>
+      </w:pPr>
+      <w:r>
+        <w:rPr>
+          <w:rFonts w:ascii="Arial" w:hAnsi="Arial"/>
+          <w:b w:val="0"/>
+          <w:i w:val="0"/>
+          <w:color w:val="5D4000"/>
+          <w:sz w:val="20"/>
+          <w:lang w:bidi="he-IL"/>
+        </w:rPr>
+        <w:t xml:space="preserve">  2. הציעו להם שיפט בונוס: +10% על כל מסירה בסוף שבוע</w:t>
+      </w:r>
+    </w:p>
+    <w:p>
+      <w:pPr>
+        <w:bidi w:val="1"/>
+        <w:spacing w:before="40" w:after="60"/>
+        <w:ind w:left="227"/>
+        <w:jc w:val="right"/>
+        <w:shd w:val="clear" w:color="auto" w:fill="FFFDE7"/>
+      </w:pPr>
+      <w:r>
+        <w:rPr>
+          <w:rFonts w:ascii="Arial" w:hAnsi="Arial"/>
+          <w:b w:val="0"/>
+          <w:i w:val="0"/>
+          <w:color w:val="5D4000"/>
+          <w:sz w:val="20"/>
+          <w:lang w:bidi="he-IL"/>
+        </w:rPr>
+        <w:t xml:space="preserve">  3. הפעילו את המערך כבר השבת הקרובה — יש נתון בייסליין למדידה</w:t>
+      </w:r>
+    </w:p>
+    <w:p>
+      <w:pPr>
+        <w:bidi w:val="1"/>
+        <w:spacing w:before="40" w:after="60"/>
+        <w:ind w:left="227"/>
+        <w:jc w:val="right"/>
+        <w:shd w:val="clear" w:color="auto" w:fill="FFFDE7"/>
+      </w:pPr>
+      <w:r>
+        <w:rPr>
+          <w:rFonts w:ascii="Arial" w:hAnsi="Arial"/>
+          <w:b w:val="0"/>
+          <w:i w:val="0"/>
+          <w:color w:val="5D4000"/>
+          <w:sz w:val="20"/>
+          <w:lang w:bidi="he-IL"/>
+        </w:rPr>
+      </w:r>
+    </w:p>
+    <w:p>
+      <w:pPr>
+        <w:bidi w:val="1"/>
+        <w:spacing w:before="40" w:after="60"/>
+        <w:ind w:left="227"/>
+        <w:jc w:val="right"/>
+        <w:shd w:val="clear" w:color="auto" w:fill="FFFDE7"/>
+      </w:pPr>
+      <w:r>
+        <w:rPr>
+          <w:rFonts w:ascii="Arial" w:hAnsi="Arial"/>
+          <w:b w:val="0"/>
+          <w:i w:val="0"/>
+          <w:color w:val="5D4000"/>
+          <w:sz w:val="20"/>
+          <w:lang w:bidi="he-IL"/>
+        </w:rPr>
+        <w:t>למה דווקא זה:</w:t>
+      </w:r>
+    </w:p>
+    <w:p>
+      <w:pPr>
+        <w:bidi w:val="1"/>
+        <w:spacing w:before="40" w:after="60"/>
+        <w:ind w:left="227"/>
+        <w:jc w:val="right"/>
+        <w:shd w:val="clear" w:color="auto" w:fill="FFFDE7"/>
+      </w:pPr>
+      <w:r>
+        <w:rPr>
+          <w:rFonts w:ascii="Arial" w:hAnsi="Arial"/>
+          <w:b w:val="0"/>
+          <w:i w:val="0"/>
+          <w:color w:val="5D4000"/>
+          <w:sz w:val="20"/>
+          <w:lang w:bidi="he-IL"/>
+        </w:rPr>
+        <w:t xml:space="preserve">  • שבת: 271 הזמנות/יום, מסירה 63.1% — פער של 4.4% מהממוצע</w:t>
+      </w:r>
+    </w:p>
+    <w:p>
+      <w:pPr>
+        <w:bidi w:val="1"/>
+        <w:spacing w:before="40" w:after="60"/>
+        <w:ind w:left="227"/>
+        <w:jc w:val="right"/>
+        <w:shd w:val="clear" w:color="auto" w:fill="FFFDE7"/>
+      </w:pPr>
+      <w:r>
+        <w:rPr>
+          <w:rFonts w:ascii="Arial" w:hAnsi="Arial"/>
+          <w:b w:val="0"/>
+          <w:i w:val="0"/>
+          <w:color w:val="5D4000"/>
+          <w:sz w:val="20"/>
+          <w:lang w:bidi="he-IL"/>
+        </w:rPr>
+        <w:t xml:space="preserve">  • כל שיפור של 5% בשבת = ~68 הזמנות נוספות שנמסרות</w:t>
+      </w:r>
+    </w:p>
+    <w:p>
+      <w:pPr>
+        <w:bidi w:val="1"/>
+        <w:spacing w:before="40" w:after="60"/>
+        <w:ind w:left="227"/>
+        <w:jc w:val="right"/>
+        <w:shd w:val="clear" w:color="auto" w:fill="FFFDE7"/>
+      </w:pPr>
+      <w:r>
+        <w:rPr>
+          <w:rFonts w:ascii="Arial" w:hAnsi="Arial"/>
+          <w:b w:val="0"/>
+          <w:i w:val="0"/>
+          <w:color w:val="5D4000"/>
+          <w:sz w:val="20"/>
+          <w:lang w:bidi="he-IL"/>
+        </w:rPr>
+        <w:t xml:space="preserve">  • בAOV של ₪122.76 = ₪8,348 הכנסה נוספת בשבת אחת</w:t>
+      </w:r>
+    </w:p>
+    <w:p>
+      <w:pPr>
+        <w:bidi w:val="1"/>
+        <w:spacing w:before="40" w:after="60"/>
+        <w:ind w:left="227"/>
+        <w:jc w:val="right"/>
+        <w:shd w:val="clear" w:color="auto" w:fill="FFFDE7"/>
+      </w:pPr>
+      <w:r>
+        <w:rPr>
+          <w:rFonts w:ascii="Arial" w:hAnsi="Arial"/>
+          <w:b w:val="0"/>
+          <w:i w:val="0"/>
+          <w:color w:val="5D4000"/>
+          <w:sz w:val="20"/>
+          <w:lang w:bidi="he-IL"/>
+        </w:rPr>
+        <w:t xml:space="preserve">  • החזר השקעה: עלות בונוס לשליחים ~₪2,000 → ROI חיובי מהשבת הראשונה</w:t>
+      </w:r>
+    </w:p>
+    <w:p>
+      <w:pPr>
+        <w:spacing w:after="80"/>
+      </w:pPr>
+    </w:p>
+    <w:p>
+      <w:pPr>
+        <w:spacing w:after="120"/>
+      </w:pPr>
+    </w:p>
+    <w:p>
+      <w:pPr>
+        <w:bidi w:val="1"/>
+        <w:spacing w:before="200" w:after="20"/>
+        <w:jc w:val="right"/>
+      </w:pPr>
+      <w:r>
+        <w:rPr>
+          <w:rFonts w:ascii="Arial" w:hAnsi="Arial"/>
+          <w:b/>
+          <w:i w:val="0"/>
+          <w:color w:val="1A376C"/>
+          <w:sz w:val="22"/>
+          <w:lang w:bidi="he-IL"/>
+        </w:rPr>
+        <w:t>שקופית 6 — שאלה שהייתי רוצה לשאול (ולא נשאלה)</w:t>
+      </w:r>
+    </w:p>
+    <w:p>
+      <w:pPr>
+        <w:bidi w:val="1"/>
+        <w:spacing w:before="0" w:after="0"/>
+        <w:jc w:val="right"/>
+        <w:pBdr>
+          <w:bottom w:val="single" w:sz="6" w:space="1" w:color="CCCCCC"/>
+        </w:pBdr>
+      </w:pPr>
+    </w:p>
+    <w:p>
+      <w:pPr>
+        <w:bidi w:val="1"/>
+        <w:spacing w:before="80" w:after="120"/>
+        <w:jc w:val="right"/>
+      </w:pPr>
+      <w:r>
+        <w:rPr>
+          <w:rFonts w:ascii="Arial" w:hAnsi="Arial"/>
+          <w:b/>
+          <w:i w:val="0"/>
+          <w:color w:val="1A376C"/>
+          <w:sz w:val="24"/>
+          <w:lang w:bidi="he-IL"/>
+        </w:rPr>
+        <w:t>מהו ה-LTV של לקוח חוזר לעומת לקוח חד-פעמי, ומה גורם ללקוח לחזור?</w:t>
+      </w:r>
+    </w:p>
+    <w:p>
+      <w:pPr>
+        <w:bidi w:val="1"/>
+        <w:spacing w:before="60" w:after="60"/>
+        <w:jc w:val="right"/>
+      </w:pPr>
+      <w:r>
+        <w:rPr>
+          <w:rFonts w:ascii="Arial" w:hAnsi="Arial"/>
+          <w:b w:val="0"/>
+          <w:i w:val="0"/>
+          <w:color w:val="595959"/>
+          <w:sz w:val="22"/>
+          <w:lang w:bidi="he-IL"/>
+        </w:rPr>
+        <w:t>הדאטא מראה 42.3% לקוחות חוזרים — אבל לא יודעים האם הם שווים יותר, מזמינים לעתים קרובות יותר, או מרוצים יותר.</w:t>
+      </w:r>
+    </w:p>
+    <w:p>
+      <w:pPr>
+        <w:bidi w:val="1"/>
+        <w:spacing w:before="60" w:after="120"/>
+        <w:ind w:left="283"/>
+        <w:jc w:val="right"/>
+      </w:pPr>
+      <w:r>
+        <w:rPr>
+          <w:rFonts w:ascii="Arial" w:hAnsi="Arial"/>
+          <w:b/>
+          <w:i w:val="0"/>
+          <w:color w:val="2674C1"/>
+          <w:sz w:val="22"/>
+          <w:lang w:bidi="he-IL"/>
+        </w:rPr>
+        <w:t xml:space="preserve">• </w:t>
+      </w:r>
+      <w:r>
+        <w:rPr>
+          <w:rFonts w:ascii="Arial" w:hAnsi="Arial"/>
+          <w:b w:val="0"/>
+          <w:i w:val="0"/>
+          <w:color w:val="595959"/>
+          <w:sz w:val="22"/>
+          <w:lang w:bidi="he-IL"/>
+        </w:rPr>
+        <w:t>למה זה חשוב: בשוק מסירה, עלות רכישת לקוח חדש גבוהה פי 5–7 מעלות שימור. אם נדע מה מבדיל לקוח שחוזר (אזור, שעה, עסק, שיטת תשלום, שיעור מסירה שקיבל) — נוכל לתכנן את כל השרשרת הערכית סביב שימור, לא רק סביב רכישה.</w:t>
+      </w:r>
+    </w:p>
+    <w:p>
+      <w:pPr>
+        <w:bidi w:val="1"/>
+        <w:spacing w:before="60" w:after="120"/>
+        <w:ind w:left="283"/>
+        <w:jc w:val="right"/>
+      </w:pPr>
+      <w:r>
+        <w:rPr>
+          <w:rFonts w:ascii="Arial" w:hAnsi="Arial"/>
+          <w:b/>
+          <w:i w:val="0"/>
+          <w:color w:val="2674C1"/>
+          <w:sz w:val="22"/>
+          <w:lang w:bidi="he-IL"/>
+        </w:rPr>
+        <w:t xml:space="preserve">• </w:t>
+      </w:r>
+      <w:r>
+        <w:rPr>
+          <w:rFonts w:ascii="Arial" w:hAnsi="Arial"/>
+          <w:b w:val="0"/>
+          <w:i w:val="0"/>
+          <w:color w:val="595959"/>
+          <w:sz w:val="22"/>
+          <w:lang w:bidi="he-IL"/>
+        </w:rPr>
+        <w:t>השאלה הנגזרת: כמה כדאי להשקיע בוודאי מסירה (driver supply) כדי שלקוח שהזמין בפעם הראשונה יחזור בפעם השנייה? אם מסירה כושלת = אובדן לקוח, ה-ROI של שיפור delivery rate גבוה בהרבה ממה שנראה ממבט ראשון.</w:t>
+      </w:r>
+    </w:p>
+    <w:p>
+      <w:pPr>
+        <w:bidi w:val="1"/>
+        <w:spacing w:before="120" w:after="0"/>
+        <w:jc w:val="right"/>
+        <w:shd w:val="clear" w:color="auto" w:fill="E8F5E9"/>
+      </w:pPr>
+      <w:r>
+        <w:rPr>
+          <w:rFonts w:ascii="Arial" w:hAnsi="Arial"/>
+          <w:b/>
+          <w:i w:val="0"/>
+          <w:color w:val="1B5E20"/>
+          <w:sz w:val="20"/>
+          <w:lang w:bidi="he-IL"/>
+        </w:rPr>
+        <w:t xml:space="preserve">  תובנה עסקית:</w:t>
+      </w:r>
+    </w:p>
+    <w:p>
+      <w:pPr>
+        <w:bidi w:val="1"/>
+        <w:spacing w:before="0" w:after="120"/>
+        <w:ind w:left="227"/>
+        <w:jc w:val="right"/>
+        <w:shd w:val="clear" w:color="auto" w:fill="F1F8F1"/>
+      </w:pPr>
+      <w:r>
+        <w:rPr>
+          <w:rFonts w:ascii="Arial" w:hAnsi="Arial"/>
+          <w:b w:val="0"/>
+          <w:i w:val="0"/>
+          <w:color w:val="1B5E20"/>
+          <w:sz w:val="20"/>
+          <w:lang w:bidi="he-IL"/>
+        </w:rPr>
+        <w:t>תובנת הסיום: HAAT יושבת על מוצר עם ביקוש אמיתי (236 הזמנות/יום ועולה). האתגר הוא לא לגדול בביקוש — אלא לא לאבד 1 מכל 3 לקוחות בדרך. השליח הוא נקודת הכישלון, והוא גם ההזדמנות הכי גדולה.</w:t>
       </w:r>
     </w:p>
     <w:p>

</xml_diff>